<commit_message>
Fix: Correct Seonga to seonga and Suhyeon to suhyeon, and create suhyun redirect files
</commit_message>
<xml_diff>
--- a/로그인처치_성도별_성경통독앱_안내_및_카톡발송메시지_2단계발송용.docx
+++ b/로그인처치_성도별_성경통독앱_안내_및_카톡발송메시지_2단계발송용.docx
@@ -43,7 +43,7 @@
         <w:br/>
         <w:t>1. 핵심 편의 기능</w:t>
         <w:br/>
-        <w:t>- 역본 전환: 개역개정·새번역·개역한글 변경 시 읽던 위치부터 자동 재생 및 하이라이트 유지</w:t>
+        <w:t>- 역본 전환: 개역개정·새번역·개역한글 변경 시 읽던 위치부터 자동 재생 및 하일라이트 유지</w:t>
         <w:br/>
         <w:t>- 구절 꾹 누르기: 말씀 복사</w:t>
         <w:br/>
@@ -707,7 +707,7 @@
         <w:br/>
         <w:t>▶ 손수현 성도 전용 성경통독앱 링크:</w:t>
         <w:br/>
-        <w:t>https://loginchurch.vercel.app/suhyun</w:t>
+        <w:t>https://loginchurch.vercel.app/suhyeon</w:t>
         <w:br/>
         <w:br/>
         <w:t>"주의 말씀은 내 발에 등이요 내 길에 빛이니이다" (시편 119:105)</w:t>
@@ -857,7 +857,7 @@
         <w:br/>
         <w:t>▶ 이성아 집사 전용 성경통독앱 링크:</w:t>
         <w:br/>
-        <w:t>https://loginchurch.vercel.app/sunga</w:t>
+        <w:t>https://loginchurch.vercel.app/seonga</w:t>
         <w:br/>
         <w:br/>
         <w:t>"주의 말씀은 내 발에 등이요 내 길에 빛이니이다" (시편 119:105)</w:t>

</xml_diff>

<commit_message>
Fix: Restore Seonga URL to sunga and Suhyeon URL to suhyun as requested
</commit_message>
<xml_diff>
--- a/로그인처치_성도별_성경통독앱_안내_및_카톡발송메시지_2단계발송용.docx
+++ b/로그인처치_성도별_성경통독앱_안내_및_카톡발송메시지_2단계발송용.docx
@@ -707,7 +707,7 @@
         <w:br/>
         <w:t>▶ 손수현 성도 전용 성경통독앱 링크:</w:t>
         <w:br/>
-        <w:t>https://loginchurch.vercel.app/suhyeon</w:t>
+        <w:t>https://loginchurch.vercel.app/suhyun</w:t>
         <w:br/>
         <w:br/>
         <w:t>"주의 말씀은 내 발에 등이요 내 길에 빛이니이다" (시편 119:105)</w:t>
@@ -857,7 +857,7 @@
         <w:br/>
         <w:t>▶ 이성아 집사 전용 성경통독앱 링크:</w:t>
         <w:br/>
-        <w:t>https://loginchurch.vercel.app/seonga</w:t>
+        <w:t>https://loginchurch.vercel.app/sunga</w:t>
         <w:br/>
         <w:br/>
         <w:t>"주의 말씀은 내 발에 등이요 내 길에 빛이니이다" (시편 119:105)</w:t>

</xml_diff>